<commit_message>
Clean Up - 19/04/2026
</commit_message>
<xml_diff>
--- a/SEM 6/WT/Documentation/SREXP4.docx
+++ b/SEM 6/WT/Documentation/SREXP4.docx
@@ -490,7 +490,6 @@
           <w:b/>
           <w:bCs/>
         </w:rPr>
-        <w:lastRenderedPageBreak/>
         <w:t>Interface:</w:t>
       </w:r>
       <w:r>
@@ -502,6 +501,7 @@
         <w:pStyle w:val="Heading"/>
       </w:pPr>
       <w:r>
+        <w:lastRenderedPageBreak/>
         <w:t>Procedure (Detailed)</w:t>
       </w:r>
       <w:r>
@@ -1111,8 +1111,12 @@
       </w:r>
     </w:p>
     <w:sectPr>
-      <w:headerReference w:type="default" r:id="rId13"/>
-      <w:footerReference w:type="default" r:id="rId14"/>
+      <w:headerReference w:type="even" r:id="rId13"/>
+      <w:headerReference w:type="default" r:id="rId14"/>
+      <w:footerReference w:type="even" r:id="rId15"/>
+      <w:footerReference w:type="default" r:id="rId16"/>
+      <w:headerReference w:type="first" r:id="rId17"/>
+      <w:footerReference w:type="first" r:id="rId18"/>
       <w:pgSz w:w="11906" w:h="16838"/>
       <w:pgMar w:top="720" w:right="720" w:bottom="720" w:left="720" w:header="708" w:footer="708" w:gutter="0"/>
       <w:cols w:space="708"/>
@@ -1152,6 +1156,16 @@
   <w:p>
     <w:pPr>
       <w:pStyle w:val="Footer"/>
+    </w:pPr>
+  </w:p>
+</w:ftr>
+</file>
+
+<file path=word/footer2.xml><?xml version="1.0" encoding="utf-8"?>
+<w:ftr xmlns:wpc="http://schemas.microsoft.com/office/word/2010/wordprocessingCanvas" xmlns:cx="http://schemas.microsoft.com/office/drawing/2014/chartex" xmlns:cx1="http://schemas.microsoft.com/office/drawing/2015/9/8/chartex" xmlns:cx2="http://schemas.microsoft.com/office/drawing/2015/10/21/chartex" xmlns:cx3="http://schemas.microsoft.com/office/drawing/2016/5/9/chartex" xmlns:cx4="http://schemas.microsoft.com/office/drawing/2016/5/10/chartex" xmlns:cx5="http://schemas.microsoft.com/office/drawing/2016/5/11/chartex" xmlns:cx6="http://schemas.microsoft.com/office/drawing/2016/5/12/chartex" xmlns:cx7="http://schemas.microsoft.com/office/drawing/2016/5/13/chartex" xmlns:cx8="http://schemas.microsoft.com/office/drawing/2016/5/14/chartex" xmlns:mc="http://schemas.openxmlformats.org/markup-compatibility/2006" xmlns:aink="http://schemas.microsoft.com/office/drawing/2016/ink" xmlns:am3d="http://schemas.microsoft.com/office/drawing/2017/model3d" xmlns:o="urn:schemas-microsoft-com:office:office" xmlns:r="http://schemas.openxmlformats.org/officeDocument/2006/relationships" xmlns:m="http://schemas.openxmlformats.org/officeDocument/2006/math" xmlns:v="urn:schemas-microsoft-com:vml" xmlns:wp14="http://schemas.microsoft.com/office/word/2010/wordprocessingDrawing" xmlns:wp="http://schemas.openxmlformats.org/drawingml/2006/wordprocessingDrawing" xmlns:w10="urn:schemas-microsoft-com:office:word" xmlns:w="http://schemas.openxmlformats.org/wordprocessingml/2006/main" xmlns:w14="http://schemas.microsoft.com/office/word/2010/wordml" xmlns:w15="http://schemas.microsoft.com/office/word/2012/wordml" xmlns:w16cex="http://schemas.microsoft.com/office/word/2018/wordml/cex" xmlns:w16cid="http://schemas.microsoft.com/office/word/2016/wordml/cid" xmlns:w16="http://schemas.microsoft.com/office/word/2018/wordml" xmlns:w16sdtdh="http://schemas.microsoft.com/office/word/2020/wordml/sdtdatahash" xmlns:w16se="http://schemas.microsoft.com/office/word/2015/wordml/symex" xmlns:wpg="http://schemas.microsoft.com/office/word/2010/wordprocessingGroup" xmlns:wpi="http://schemas.microsoft.com/office/word/2010/wordprocessingInk" xmlns:wne="http://schemas.microsoft.com/office/word/2006/wordml" xmlns:wps="http://schemas.microsoft.com/office/word/2010/wordprocessingShape" mc:Ignorable="w14 w15 w16se w16cid w16 w16cex w16sdtdh wp14">
+  <w:p>
+    <w:pPr>
+      <w:pStyle w:val="Footer"/>
       <w:pBdr>
         <w:top w:val="single" w:sz="4" w:space="8" w:color="4472C4" w:themeColor="accent1"/>
       </w:pBdr>
@@ -1275,6 +1289,16 @@
       <w:rPr>
         <w:color w:val="000000" w:themeColor="text1"/>
       </w:rPr>
+    </w:pPr>
+  </w:p>
+</w:ftr>
+</file>
+
+<file path=word/footer3.xml><?xml version="1.0" encoding="utf-8"?>
+<w:ftr xmlns:wpc="http://schemas.microsoft.com/office/word/2010/wordprocessingCanvas" xmlns:cx="http://schemas.microsoft.com/office/drawing/2014/chartex" xmlns:cx1="http://schemas.microsoft.com/office/drawing/2015/9/8/chartex" xmlns:cx2="http://schemas.microsoft.com/office/drawing/2015/10/21/chartex" xmlns:cx3="http://schemas.microsoft.com/office/drawing/2016/5/9/chartex" xmlns:cx4="http://schemas.microsoft.com/office/drawing/2016/5/10/chartex" xmlns:cx5="http://schemas.microsoft.com/office/drawing/2016/5/11/chartex" xmlns:cx6="http://schemas.microsoft.com/office/drawing/2016/5/12/chartex" xmlns:cx7="http://schemas.microsoft.com/office/drawing/2016/5/13/chartex" xmlns:cx8="http://schemas.microsoft.com/office/drawing/2016/5/14/chartex" xmlns:mc="http://schemas.openxmlformats.org/markup-compatibility/2006" xmlns:aink="http://schemas.microsoft.com/office/drawing/2016/ink" xmlns:am3d="http://schemas.microsoft.com/office/drawing/2017/model3d" xmlns:o="urn:schemas-microsoft-com:office:office" xmlns:r="http://schemas.openxmlformats.org/officeDocument/2006/relationships" xmlns:m="http://schemas.openxmlformats.org/officeDocument/2006/math" xmlns:v="urn:schemas-microsoft-com:vml" xmlns:wp14="http://schemas.microsoft.com/office/word/2010/wordprocessingDrawing" xmlns:wp="http://schemas.openxmlformats.org/drawingml/2006/wordprocessingDrawing" xmlns:w10="urn:schemas-microsoft-com:office:word" xmlns:w="http://schemas.openxmlformats.org/wordprocessingml/2006/main" xmlns:w14="http://schemas.microsoft.com/office/word/2010/wordml" xmlns:w15="http://schemas.microsoft.com/office/word/2012/wordml" xmlns:w16cex="http://schemas.microsoft.com/office/word/2018/wordml/cex" xmlns:w16cid="http://schemas.microsoft.com/office/word/2016/wordml/cid" xmlns:w16="http://schemas.microsoft.com/office/word/2018/wordml" xmlns:w16sdtdh="http://schemas.microsoft.com/office/word/2020/wordml/sdtdatahash" xmlns:w16se="http://schemas.microsoft.com/office/word/2015/wordml/symex" xmlns:wpg="http://schemas.microsoft.com/office/word/2010/wordprocessingGroup" xmlns:wpi="http://schemas.microsoft.com/office/word/2010/wordprocessingInk" xmlns:wne="http://schemas.microsoft.com/office/word/2006/wordml" xmlns:wps="http://schemas.microsoft.com/office/word/2010/wordprocessingShape" mc:Ignorable="w14 w15 w16se w16cid w16 w16cex w16sdtdh wp14">
+  <w:p>
+    <w:pPr>
+      <w:pStyle w:val="Footer"/>
     </w:pPr>
   </w:p>
 </w:ftr>
@@ -1310,73 +1334,30 @@
   <w:p>
     <w:pPr>
       <w:pStyle w:val="Header"/>
-      <w:pBdr>
-        <w:bottom w:val="single" w:sz="4" w:space="8" w:color="4472C4" w:themeColor="accent1"/>
-      </w:pBdr>
-      <w:spacing w:after="360"/>
-      <w:contextualSpacing/>
-      <w:rPr>
-        <w:color w:val="000000" w:themeColor="text1"/>
-      </w:rPr>
     </w:pPr>
-    <w:sdt>
-      <w:sdtPr>
-        <w:rPr>
-          <w:color w:val="000000" w:themeColor="text1"/>
-        </w:rPr>
-        <w:alias w:val="Title"/>
-        <w:tag w:val=""/>
-        <w:id w:val="942040131"/>
-        <w:placeholder>
-          <w:docPart w:val="2127A1DDDC8044A1A44284A04A165CEC"/>
-        </w:placeholder>
-        <w:dataBinding w:prefixMappings="xmlns:ns0='http://purl.org/dc/elements/1.1/' xmlns:ns1='http://schemas.openxmlformats.org/package/2006/metadata/core-properties' " w:xpath="/ns1:coreProperties[1]/ns0:title[1]" w:storeItemID="{6C3C8BC8-F283-45AE-878A-BAB7291924A1}"/>
-        <w:text/>
-      </w:sdtPr>
-      <w:sdtEndPr/>
-      <w:sdtContent>
-        <w:r>
-          <w:rPr>
-            <w:color w:val="000000" w:themeColor="text1"/>
-          </w:rPr>
-          <w:t>Abdur R. Qureshi</w:t>
-        </w:r>
-      </w:sdtContent>
-    </w:sdt>
-    <w:r>
-      <w:rPr>
-        <w:color w:val="000000" w:themeColor="text1"/>
-      </w:rPr>
-      <w:tab/>
-      <w:t xml:space="preserve">                                                                                       </w:t>
-    </w:r>
-    <w:r>
-      <w:rPr>
-        <w:color w:val="000000" w:themeColor="text1"/>
-      </w:rPr>
-      <w:tab/>
-      <w:t xml:space="preserve">   </w:t>
-    </w:r>
-    <w:r>
-      <w:rPr>
-        <w:color w:val="000000" w:themeColor="text1"/>
-      </w:rPr>
-      <w:tab/>
-      <w:t xml:space="preserve">       </w:t>
-    </w:r>
-    <w:r>
-      <w:rPr>
-        <w:color w:val="000000" w:themeColor="text1"/>
-      </w:rPr>
-      <w:t xml:space="preserve"> 242466</w:t>
-    </w:r>
   </w:p>
+</w:hdr>
+</file>
+
+<file path=word/header2.xml><?xml version="1.0" encoding="utf-8"?>
+<w:hdr xmlns:wpc="http://schemas.microsoft.com/office/word/2010/wordprocessingCanvas" xmlns:cx="http://schemas.microsoft.com/office/drawing/2014/chartex" xmlns:cx1="http://schemas.microsoft.com/office/drawing/2015/9/8/chartex" xmlns:cx2="http://schemas.microsoft.com/office/drawing/2015/10/21/chartex" xmlns:cx3="http://schemas.microsoft.com/office/drawing/2016/5/9/chartex" xmlns:cx4="http://schemas.microsoft.com/office/drawing/2016/5/10/chartex" xmlns:cx5="http://schemas.microsoft.com/office/drawing/2016/5/11/chartex" xmlns:cx6="http://schemas.microsoft.com/office/drawing/2016/5/12/chartex" xmlns:cx7="http://schemas.microsoft.com/office/drawing/2016/5/13/chartex" xmlns:cx8="http://schemas.microsoft.com/office/drawing/2016/5/14/chartex" xmlns:mc="http://schemas.openxmlformats.org/markup-compatibility/2006" xmlns:aink="http://schemas.microsoft.com/office/drawing/2016/ink" xmlns:am3d="http://schemas.microsoft.com/office/drawing/2017/model3d" xmlns:o="urn:schemas-microsoft-com:office:office" xmlns:r="http://schemas.openxmlformats.org/officeDocument/2006/relationships" xmlns:m="http://schemas.openxmlformats.org/officeDocument/2006/math" xmlns:v="urn:schemas-microsoft-com:vml" xmlns:wp14="http://schemas.microsoft.com/office/word/2010/wordprocessingDrawing" xmlns:wp="http://schemas.openxmlformats.org/drawingml/2006/wordprocessingDrawing" xmlns:w10="urn:schemas-microsoft-com:office:word" xmlns:w="http://schemas.openxmlformats.org/wordprocessingml/2006/main" xmlns:w14="http://schemas.microsoft.com/office/word/2010/wordml" xmlns:w15="http://schemas.microsoft.com/office/word/2012/wordml" xmlns:w16cex="http://schemas.microsoft.com/office/word/2018/wordml/cex" xmlns:w16cid="http://schemas.microsoft.com/office/word/2016/wordml/cid" xmlns:w16="http://schemas.microsoft.com/office/word/2018/wordml" xmlns:w16sdtdh="http://schemas.microsoft.com/office/word/2020/wordml/sdtdatahash" xmlns:w16se="http://schemas.microsoft.com/office/word/2015/wordml/symex" xmlns:wpg="http://schemas.microsoft.com/office/word/2010/wordprocessingGroup" xmlns:wpi="http://schemas.microsoft.com/office/word/2010/wordprocessingInk" xmlns:wne="http://schemas.microsoft.com/office/word/2006/wordml" xmlns:wps="http://schemas.microsoft.com/office/word/2010/wordprocessingShape" mc:Ignorable="w14 w15 w16se w16cid w16 w16cex w16sdtdh wp14">
   <w:p>
     <w:pPr>
       <w:pStyle w:val="Header"/>
       <w:rPr>
         <w:color w:val="000000" w:themeColor="text1"/>
-      </w:rPr>
+        <w:lang w:val="en-US"/>
+      </w:rPr>
+    </w:pPr>
+  </w:p>
+</w:hdr>
+</file>
+
+<file path=word/header3.xml><?xml version="1.0" encoding="utf-8"?>
+<w:hdr xmlns:wpc="http://schemas.microsoft.com/office/word/2010/wordprocessingCanvas" xmlns:cx="http://schemas.microsoft.com/office/drawing/2014/chartex" xmlns:cx1="http://schemas.microsoft.com/office/drawing/2015/9/8/chartex" xmlns:cx2="http://schemas.microsoft.com/office/drawing/2015/10/21/chartex" xmlns:cx3="http://schemas.microsoft.com/office/drawing/2016/5/9/chartex" xmlns:cx4="http://schemas.microsoft.com/office/drawing/2016/5/10/chartex" xmlns:cx5="http://schemas.microsoft.com/office/drawing/2016/5/11/chartex" xmlns:cx6="http://schemas.microsoft.com/office/drawing/2016/5/12/chartex" xmlns:cx7="http://schemas.microsoft.com/office/drawing/2016/5/13/chartex" xmlns:cx8="http://schemas.microsoft.com/office/drawing/2016/5/14/chartex" xmlns:mc="http://schemas.openxmlformats.org/markup-compatibility/2006" xmlns:aink="http://schemas.microsoft.com/office/drawing/2016/ink" xmlns:am3d="http://schemas.microsoft.com/office/drawing/2017/model3d" xmlns:o="urn:schemas-microsoft-com:office:office" xmlns:r="http://schemas.openxmlformats.org/officeDocument/2006/relationships" xmlns:m="http://schemas.openxmlformats.org/officeDocument/2006/math" xmlns:v="urn:schemas-microsoft-com:vml" xmlns:wp14="http://schemas.microsoft.com/office/word/2010/wordprocessingDrawing" xmlns:wp="http://schemas.openxmlformats.org/drawingml/2006/wordprocessingDrawing" xmlns:w10="urn:schemas-microsoft-com:office:word" xmlns:w="http://schemas.openxmlformats.org/wordprocessingml/2006/main" xmlns:w14="http://schemas.microsoft.com/office/word/2010/wordml" xmlns:w15="http://schemas.microsoft.com/office/word/2012/wordml" xmlns:w16cex="http://schemas.microsoft.com/office/word/2018/wordml/cex" xmlns:w16cid="http://schemas.microsoft.com/office/word/2016/wordml/cid" xmlns:w16="http://schemas.microsoft.com/office/word/2018/wordml" xmlns:w16sdtdh="http://schemas.microsoft.com/office/word/2020/wordml/sdtdatahash" xmlns:w16se="http://schemas.microsoft.com/office/word/2015/wordml/symex" xmlns:wpg="http://schemas.microsoft.com/office/word/2010/wordprocessingGroup" xmlns:wpi="http://schemas.microsoft.com/office/word/2010/wordprocessingInk" xmlns:wne="http://schemas.microsoft.com/office/word/2006/wordml" xmlns:wps="http://schemas.microsoft.com/office/word/2010/wordprocessingShape" mc:Ignorable="w14 w15 w16se w16cid w16 w16cex w16sdtdh wp14">
+  <w:p>
+    <w:pPr>
+      <w:pStyle w:val="Header"/>
     </w:pPr>
   </w:p>
 </w:hdr>
@@ -7885,625 +7866,6 @@
 </w:styles>
 </file>
 
-<file path=word/glossary/document.xml><?xml version="1.0" encoding="utf-8"?>
-<w:glossaryDocument xmlns:wpc="http://schemas.microsoft.com/office/word/2010/wordprocessingCanvas" xmlns:cx="http://schemas.microsoft.com/office/drawing/2014/chartex" xmlns:cx1="http://schemas.microsoft.com/office/drawing/2015/9/8/chartex" xmlns:cx2="http://schemas.microsoft.com/office/drawing/2015/10/21/chartex" xmlns:cx3="http://schemas.microsoft.com/office/drawing/2016/5/9/chartex" xmlns:cx4="http://schemas.microsoft.com/office/drawing/2016/5/10/chartex" xmlns:cx5="http://schemas.microsoft.com/office/drawing/2016/5/11/chartex" xmlns:cx6="http://schemas.microsoft.com/office/drawing/2016/5/12/chartex" xmlns:cx7="http://schemas.microsoft.com/office/drawing/2016/5/13/chartex" xmlns:cx8="http://schemas.microsoft.com/office/drawing/2016/5/14/chartex" xmlns:mc="http://schemas.openxmlformats.org/markup-compatibility/2006" xmlns:aink="http://schemas.microsoft.com/office/drawing/2016/ink" xmlns:am3d="http://schemas.microsoft.com/office/drawing/2017/model3d" xmlns:o="urn:schemas-microsoft-com:office:office" xmlns:r="http://schemas.openxmlformats.org/officeDocument/2006/relationships" xmlns:m="http://schemas.openxmlformats.org/officeDocument/2006/math" xmlns:v="urn:schemas-microsoft-com:vml" xmlns:wp14="http://schemas.microsoft.com/office/word/2010/wordprocessingDrawing" xmlns:wp="http://schemas.openxmlformats.org/drawingml/2006/wordprocessingDrawing" xmlns:w10="urn:schemas-microsoft-com:office:word" xmlns:w="http://schemas.openxmlformats.org/wordprocessingml/2006/main" xmlns:w14="http://schemas.microsoft.com/office/word/2010/wordml" xmlns:w15="http://schemas.microsoft.com/office/word/2012/wordml" xmlns:w16cex="http://schemas.microsoft.com/office/word/2018/wordml/cex" xmlns:w16cid="http://schemas.microsoft.com/office/word/2016/wordml/cid" xmlns:w16="http://schemas.microsoft.com/office/word/2018/wordml" xmlns:w16sdtdh="http://schemas.microsoft.com/office/word/2020/wordml/sdtdatahash" xmlns:w16se="http://schemas.microsoft.com/office/word/2015/wordml/symex" xmlns:wpg="http://schemas.microsoft.com/office/word/2010/wordprocessingGroup" xmlns:wpi="http://schemas.microsoft.com/office/word/2010/wordprocessingInk" xmlns:wne="http://schemas.microsoft.com/office/word/2006/wordml" xmlns:wps="http://schemas.microsoft.com/office/word/2010/wordprocessingShape" mc:Ignorable="w14 w15 w16se w16cid w16 w16cex w16sdtdh wp14">
-  <w:docParts>
-    <w:docPart>
-      <w:docPartPr>
-        <w:name w:val="2127A1DDDC8044A1A44284A04A165CEC"/>
-        <w:category>
-          <w:name w:val="General"/>
-          <w:gallery w:val="placeholder"/>
-        </w:category>
-        <w:types>
-          <w:type w:val="bbPlcHdr"/>
-        </w:types>
-        <w:behaviors>
-          <w:behavior w:val="content"/>
-        </w:behaviors>
-        <w:guid w:val="{27C352C7-B8DC-4907-9DF7-16A27C765149}"/>
-      </w:docPartPr>
-      <w:docPartBody>
-        <w:p>
-          <w:pPr>
-            <w:pStyle w:val="2127A1DDDC8044A1A44284A04A165CEC"/>
-          </w:pPr>
-          <w:r>
-            <w:rPr>
-              <w:color w:val="404040" w:themeColor="text1" w:themeTint="BF"/>
-            </w:rPr>
-            <w:t>[Document title]</w:t>
-          </w:r>
-        </w:p>
-      </w:docPartBody>
-    </w:docPart>
-  </w:docParts>
-</w:glossaryDocument>
-</file>
-
-<file path=word/glossary/fontTable.xml><?xml version="1.0" encoding="utf-8"?>
-<w:fonts xmlns:mc="http://schemas.openxmlformats.org/markup-compatibility/2006" xmlns:r="http://schemas.openxmlformats.org/officeDocument/2006/relationships" xmlns:w="http://schemas.openxmlformats.org/wordprocessingml/2006/main" xmlns:w14="http://schemas.microsoft.com/office/word/2010/wordml" xmlns:w15="http://schemas.microsoft.com/office/word/2012/wordml" xmlns:w16cex="http://schemas.microsoft.com/office/word/2018/wordml/cex" xmlns:w16cid="http://schemas.microsoft.com/office/word/2016/wordml/cid" xmlns:w16="http://schemas.microsoft.com/office/word/2018/wordml" xmlns:w16sdtdh="http://schemas.microsoft.com/office/word/2020/wordml/sdtdatahash" xmlns:w16se="http://schemas.microsoft.com/office/word/2015/wordml/symex" mc:Ignorable="w14 w15 w16se w16cid w16 w16cex w16sdtdh">
-  <w:font w:name="Symbol">
-    <w:panose1 w:val="05050102010706020507"/>
-    <w:charset w:val="02"/>
-    <w:family w:val="roman"/>
-    <w:pitch w:val="variable"/>
-    <w:sig w:usb0="00000000" w:usb1="10000000" w:usb2="00000000" w:usb3="00000000" w:csb0="80000000" w:csb1="00000000"/>
-  </w:font>
-  <w:font w:name="Times New Roman">
-    <w:panose1 w:val="02020603050405020304"/>
-    <w:charset w:val="00"/>
-    <w:family w:val="roman"/>
-    <w:pitch w:val="variable"/>
-    <w:sig w:usb0="E0002EFF" w:usb1="C000785B" w:usb2="00000009" w:usb3="00000000" w:csb0="000001FF" w:csb1="00000000"/>
-  </w:font>
-  <w:font w:name="Courier New">
-    <w:panose1 w:val="02070309020205020404"/>
-    <w:charset w:val="00"/>
-    <w:family w:val="modern"/>
-    <w:pitch w:val="fixed"/>
-    <w:sig w:usb0="E0002EFF" w:usb1="C0007843" w:usb2="00000009" w:usb3="00000000" w:csb0="000001FF" w:csb1="00000000"/>
-  </w:font>
-  <w:font w:name="Wingdings">
-    <w:panose1 w:val="05000000000000000000"/>
-    <w:charset w:val="02"/>
-    <w:family w:val="auto"/>
-    <w:pitch w:val="variable"/>
-    <w:sig w:usb0="00000000" w:usb1="10000000" w:usb2="00000000" w:usb3="00000000" w:csb0="80000000" w:csb1="00000000"/>
-  </w:font>
-  <w:font w:name="Noto Sans Symbols">
-    <w:altName w:val="Calibri"/>
-    <w:charset w:val="00"/>
-    <w:family w:val="auto"/>
-    <w:pitch w:val="default"/>
-  </w:font>
-  <w:font w:name="Calibri">
-    <w:panose1 w:val="020F0502020204030204"/>
-    <w:charset w:val="00"/>
-    <w:family w:val="swiss"/>
-    <w:pitch w:val="variable"/>
-    <w:sig w:usb0="E4002EFF" w:usb1="C000247B" w:usb2="00000009" w:usb3="00000000" w:csb0="000001FF" w:csb1="00000000"/>
-  </w:font>
-  <w:font w:name="JetBrains Mono NL">
-    <w:panose1 w:val="02000009000000000000"/>
-    <w:charset w:val="00"/>
-    <w:family w:val="modern"/>
-    <w:pitch w:val="fixed"/>
-    <w:sig w:usb0="A00402FF" w:usb1="1200F9FB" w:usb2="0200003C" w:usb3="00000000" w:csb0="0000019F" w:csb1="00000000"/>
-  </w:font>
-  <w:font w:name="Microsoft JhengHei">
-    <w:panose1 w:val="020B0604030504040204"/>
-    <w:charset w:val="88"/>
-    <w:family w:val="swiss"/>
-    <w:pitch w:val="variable"/>
-    <w:sig w:usb0="000002A7" w:usb1="28CF4400" w:usb2="00000016" w:usb3="00000000" w:csb0="00100009" w:csb1="00000000"/>
-  </w:font>
-  <w:font w:name="Cascadia Code">
-    <w:altName w:val="Segoe UI Symbol"/>
-    <w:panose1 w:val="020B0609020000020004"/>
-    <w:charset w:val="00"/>
-    <w:family w:val="modern"/>
-    <w:pitch w:val="fixed"/>
-    <w:sig w:usb0="A10002FF" w:usb1="4000F9FB" w:usb2="00040000" w:usb3="00000000" w:csb0="0000019F" w:csb1="00000000"/>
-  </w:font>
-  <w:font w:name="Microsoft JhengHei UI">
-    <w:panose1 w:val="020B0604030504040204"/>
-    <w:charset w:val="88"/>
-    <w:family w:val="swiss"/>
-    <w:pitch w:val="variable"/>
-    <w:sig w:usb0="000002A7" w:usb1="28CF4400" w:usb2="00000016" w:usb3="00000000" w:csb0="00100009" w:csb1="00000000"/>
-  </w:font>
-  <w:font w:name="Microsoft JhengHei Light">
-    <w:panose1 w:val="020B0304030504040204"/>
-    <w:charset w:val="88"/>
-    <w:family w:val="swiss"/>
-    <w:pitch w:val="variable"/>
-    <w:sig w:usb0="800002A7" w:usb1="28CF4400" w:usb2="00000016" w:usb3="00000000" w:csb0="00100009" w:csb1="00000000"/>
-  </w:font>
-  <w:font w:name="Calibri Light">
-    <w:panose1 w:val="020F0302020204030204"/>
-    <w:charset w:val="00"/>
-    <w:family w:val="swiss"/>
-    <w:pitch w:val="variable"/>
-    <w:sig w:usb0="E4002EFF" w:usb1="C000247B" w:usb2="00000009" w:usb3="00000000" w:csb0="000001FF" w:csb1="00000000"/>
-  </w:font>
-</w:fonts>
-</file>
-
-<file path=word/glossary/settings.xml><?xml version="1.0" encoding="utf-8"?>
-<w:settings xmlns:mc="http://schemas.openxmlformats.org/markup-compatibility/2006" xmlns:o="urn:schemas-microsoft-com:office:office" xmlns:r="http://schemas.openxmlformats.org/officeDocument/2006/relationships" xmlns:m="http://schemas.openxmlformats.org/officeDocument/2006/math" xmlns:v="urn:schemas-microsoft-com:vml" xmlns:w10="urn:schemas-microsoft-com:office:word" xmlns:w="http://schemas.openxmlformats.org/wordprocessingml/2006/main" xmlns:w14="http://schemas.microsoft.com/office/word/2010/wordml" xmlns:w15="http://schemas.microsoft.com/office/word/2012/wordml" xmlns:w16cex="http://schemas.microsoft.com/office/word/2018/wordml/cex" xmlns:w16cid="http://schemas.microsoft.com/office/word/2016/wordml/cid" xmlns:w16="http://schemas.microsoft.com/office/word/2018/wordml" xmlns:w16sdtdh="http://schemas.microsoft.com/office/word/2020/wordml/sdtdatahash" xmlns:w16se="http://schemas.microsoft.com/office/word/2015/wordml/symex" xmlns:sl="http://schemas.openxmlformats.org/schemaLibrary/2006/main" mc:Ignorable="w14 w15 w16se w16cid w16 w16cex w16sdtdh">
-  <w:view w:val="normal"/>
-  <w:defaultTabStop w:val="720"/>
-  <w:characterSpacingControl w:val="doNotCompress"/>
-  <w:compat>
-    <w:useFELayout/>
-    <w:compatSetting w:name="compatibilityMode" w:uri="http://schemas.microsoft.com/office/word" w:val="15"/>
-    <w:compatSetting w:name="overrideTableStyleFontSizeAndJustification" w:uri="http://schemas.microsoft.com/office/word" w:val="1"/>
-    <w:compatSetting w:name="enableOpenTypeFeatures" w:uri="http://schemas.microsoft.com/office/word" w:val="1"/>
-    <w:compatSetting w:name="doNotFlipMirrorIndents" w:uri="http://schemas.microsoft.com/office/word" w:val="1"/>
-    <w:compatSetting w:name="differentiateMultirowTableHeaders" w:uri="http://schemas.microsoft.com/office/word" w:val="1"/>
-    <w:compatSetting w:name="useWord2013TrackBottomHyphenation" w:uri="http://schemas.microsoft.com/office/word" w:val="0"/>
-  </w:compat>
-  <w:rsids>
-    <w:rsidRoot w:val="008238CD"/>
-    <w:rsid w:val="00172538"/>
-    <w:rsid w:val="0032147F"/>
-    <w:rsid w:val="003800D8"/>
-    <w:rsid w:val="003A6ABC"/>
-    <w:rsid w:val="004F7305"/>
-    <w:rsid w:val="006D2E04"/>
-    <w:rsid w:val="008238CD"/>
-    <w:rsid w:val="00916E54"/>
-    <w:rsid w:val="00A624F2"/>
-    <w:rsid w:val="00AC5178"/>
-    <w:rsid w:val="00AC7174"/>
-    <w:rsid w:val="00B22058"/>
-    <w:rsid w:val="00C208BF"/>
-    <w:rsid w:val="00C95DE2"/>
-    <w:rsid w:val="00D212A8"/>
-    <w:rsid w:val="00D223CD"/>
-  </w:rsids>
-  <m:mathPr>
-    <m:mathFont m:val="Cambria Math"/>
-    <m:brkBin m:val="before"/>
-    <m:brkBinSub m:val="--"/>
-    <m:smallFrac m:val="0"/>
-    <m:dispDef/>
-    <m:lMargin m:val="0"/>
-    <m:rMargin m:val="0"/>
-    <m:defJc m:val="centerGroup"/>
-    <m:wrapIndent m:val="1440"/>
-    <m:intLim m:val="subSup"/>
-    <m:naryLim m:val="undOvr"/>
-  </m:mathPr>
-  <w:themeFontLang w:val="en-IN"/>
-  <w:clrSchemeMapping w:bg1="light1" w:t1="dark1" w:bg2="light2" w:t2="dark2" w:accent1="accent1" w:accent2="accent2" w:accent3="accent3" w:accent4="accent4" w:accent5="accent5" w:accent6="accent6" w:hyperlink="hyperlink" w:followedHyperlink="followedHyperlink"/>
-  <w:decimalSymbol w:val="."/>
-  <w:listSeparator w:val=","/>
-  <w15:chartTrackingRefBased/>
-</w:settings>
-</file>
-
-<file path=word/glossary/styles.xml><?xml version="1.0" encoding="utf-8"?>
-<w:styles xmlns:mc="http://schemas.openxmlformats.org/markup-compatibility/2006" xmlns:r="http://schemas.openxmlformats.org/officeDocument/2006/relationships" xmlns:w="http://schemas.openxmlformats.org/wordprocessingml/2006/main" xmlns:w14="http://schemas.microsoft.com/office/word/2010/wordml" xmlns:w15="http://schemas.microsoft.com/office/word/2012/wordml" xmlns:w16cex="http://schemas.microsoft.com/office/word/2018/wordml/cex" xmlns:w16cid="http://schemas.microsoft.com/office/word/2016/wordml/cid" xmlns:w16="http://schemas.microsoft.com/office/word/2018/wordml" xmlns:w16sdtdh="http://schemas.microsoft.com/office/word/2020/wordml/sdtdatahash" xmlns:w16se="http://schemas.microsoft.com/office/word/2015/wordml/symex" mc:Ignorable="w14 w15 w16se w16cid w16 w16cex w16sdtdh">
-  <w:docDefaults>
-    <w:rPrDefault>
-      <w:rPr>
-        <w:rFonts w:asciiTheme="minorHAnsi" w:eastAsiaTheme="minorEastAsia" w:hAnsiTheme="minorHAnsi" w:cstheme="minorBidi"/>
-        <w:sz w:val="22"/>
-        <w:szCs w:val="22"/>
-        <w:lang w:val="en-IN" w:eastAsia="en-IN" w:bidi="ar-SA"/>
-      </w:rPr>
-    </w:rPrDefault>
-    <w:pPrDefault>
-      <w:pPr>
-        <w:spacing w:after="160" w:line="259" w:lineRule="auto"/>
-      </w:pPr>
-    </w:pPrDefault>
-  </w:docDefaults>
-  <w:latentStyles w:defLockedState="0" w:defUIPriority="99" w:defSemiHidden="0" w:defUnhideWhenUsed="0" w:defQFormat="0" w:count="376">
-    <w:lsdException w:name="Normal" w:uiPriority="0" w:qFormat="1"/>
-    <w:lsdException w:name="heading 1" w:uiPriority="9" w:qFormat="1"/>
-    <w:lsdException w:name="heading 2" w:semiHidden="1" w:uiPriority="9" w:unhideWhenUsed="1" w:qFormat="1"/>
-    <w:lsdException w:name="heading 3" w:semiHidden="1" w:uiPriority="9" w:unhideWhenUsed="1" w:qFormat="1"/>
-    <w:lsdException w:name="heading 4" w:semiHidden="1" w:uiPriority="9" w:unhideWhenUsed="1" w:qFormat="1"/>
-    <w:lsdException w:name="heading 5" w:semiHidden="1" w:uiPriority="9" w:unhideWhenUsed="1" w:qFormat="1"/>
-    <w:lsdException w:name="heading 6" w:semiHidden="1" w:uiPriority="9" w:unhideWhenUsed="1" w:qFormat="1"/>
-    <w:lsdException w:name="heading 7" w:semiHidden="1" w:uiPriority="9" w:unhideWhenUsed="1" w:qFormat="1"/>
-    <w:lsdException w:name="heading 8" w:semiHidden="1" w:uiPriority="9" w:unhideWhenUsed="1" w:qFormat="1"/>
-    <w:lsdException w:name="heading 9" w:semiHidden="1" w:uiPriority="9" w:unhideWhenUsed="1" w:qFormat="1"/>
-    <w:lsdException w:name="index 1" w:semiHidden="1" w:unhideWhenUsed="1"/>
-    <w:lsdException w:name="index 2" w:semiHidden="1" w:unhideWhenUsed="1"/>
-    <w:lsdException w:name="index 3" w:semiHidden="1" w:unhideWhenUsed="1"/>
-    <w:lsdException w:name="index 4" w:semiHidden="1" w:unhideWhenUsed="1"/>
-    <w:lsdException w:name="index 5" w:semiHidden="1" w:unhideWhenUsed="1"/>
-    <w:lsdException w:name="index 6" w:semiHidden="1" w:unhideWhenUsed="1"/>
-    <w:lsdException w:name="index 7" w:semiHidden="1" w:unhideWhenUsed="1"/>
-    <w:lsdException w:name="index 8" w:semiHidden="1" w:unhideWhenUsed="1"/>
-    <w:lsdException w:name="index 9" w:semiHidden="1" w:unhideWhenUsed="1"/>
-    <w:lsdException w:name="toc 1" w:semiHidden="1" w:uiPriority="39" w:unhideWhenUsed="1"/>
-    <w:lsdException w:name="toc 2" w:semiHidden="1" w:uiPriority="39" w:unhideWhenUsed="1"/>
-    <w:lsdException w:name="toc 3" w:semiHidden="1" w:uiPriority="39" w:unhideWhenUsed="1"/>
-    <w:lsdException w:name="toc 4" w:semiHidden="1" w:uiPriority="39" w:unhideWhenUsed="1"/>
-    <w:lsdException w:name="toc 5" w:semiHidden="1" w:uiPriority="39" w:unhideWhenUsed="1"/>
-    <w:lsdException w:name="toc 6" w:semiHidden="1" w:uiPriority="39" w:unhideWhenUsed="1"/>
-    <w:lsdException w:name="toc 7" w:semiHidden="1" w:uiPriority="39" w:unhideWhenUsed="1"/>
-    <w:lsdException w:name="toc 8" w:semiHidden="1" w:uiPriority="39" w:unhideWhenUsed="1"/>
-    <w:lsdException w:name="toc 9" w:semiHidden="1" w:uiPriority="39" w:unhideWhenUsed="1"/>
-    <w:lsdException w:name="Normal Indent" w:semiHidden="1" w:unhideWhenUsed="1"/>
-    <w:lsdException w:name="footnote text" w:semiHidden="1" w:unhideWhenUsed="1"/>
-    <w:lsdException w:name="annotation text" w:semiHidden="1" w:unhideWhenUsed="1"/>
-    <w:lsdException w:name="header" w:semiHidden="1" w:unhideWhenUsed="1"/>
-    <w:lsdException w:name="footer" w:semiHidden="1" w:unhideWhenUsed="1"/>
-    <w:lsdException w:name="index heading" w:semiHidden="1" w:unhideWhenUsed="1"/>
-    <w:lsdException w:name="caption" w:semiHidden="1" w:uiPriority="35" w:unhideWhenUsed="1" w:qFormat="1"/>
-    <w:lsdException w:name="table of figures" w:semiHidden="1" w:unhideWhenUsed="1"/>
-    <w:lsdException w:name="envelope address" w:semiHidden="1" w:unhideWhenUsed="1"/>
-    <w:lsdException w:name="envelope return" w:semiHidden="1" w:unhideWhenUsed="1"/>
-    <w:lsdException w:name="footnote reference" w:semiHidden="1" w:unhideWhenUsed="1"/>
-    <w:lsdException w:name="annotation reference" w:semiHidden="1" w:unhideWhenUsed="1"/>
-    <w:lsdException w:name="line number" w:semiHidden="1" w:unhideWhenUsed="1"/>
-    <w:lsdException w:name="page number" w:semiHidden="1" w:unhideWhenUsed="1"/>
-    <w:lsdException w:name="endnote reference" w:semiHidden="1" w:unhideWhenUsed="1"/>
-    <w:lsdException w:name="endnote text" w:semiHidden="1" w:unhideWhenUsed="1"/>
-    <w:lsdException w:name="table of authorities" w:semiHidden="1" w:unhideWhenUsed="1"/>
-    <w:lsdException w:name="macro" w:semiHidden="1" w:unhideWhenUsed="1"/>
-    <w:lsdException w:name="toa heading" w:semiHidden="1" w:unhideWhenUsed="1"/>
-    <w:lsdException w:name="List" w:semiHidden="1" w:unhideWhenUsed="1"/>
-    <w:lsdException w:name="List Bullet" w:semiHidden="1" w:unhideWhenUsed="1"/>
-    <w:lsdException w:name="List Number" w:semiHidden="1" w:unhideWhenUsed="1"/>
-    <w:lsdException w:name="List 2" w:semiHidden="1" w:unhideWhenUsed="1"/>
-    <w:lsdException w:name="List 3" w:semiHidden="1" w:unhideWhenUsed="1"/>
-    <w:lsdException w:name="List 4" w:semiHidden="1" w:unhideWhenUsed="1"/>
-    <w:lsdException w:name="List 5" w:semiHidden="1" w:unhideWhenUsed="1"/>
-    <w:lsdException w:name="List Bullet 2" w:semiHidden="1" w:unhideWhenUsed="1"/>
-    <w:lsdException w:name="List Bullet 3" w:semiHidden="1" w:unhideWhenUsed="1"/>
-    <w:lsdException w:name="List Bullet 4" w:semiHidden="1" w:unhideWhenUsed="1"/>
-    <w:lsdException w:name="List Bullet 5" w:semiHidden="1" w:unhideWhenUsed="1"/>
-    <w:lsdException w:name="List Number 2" w:semiHidden="1" w:unhideWhenUsed="1"/>
-    <w:lsdException w:name="List Number 3" w:semiHidden="1" w:unhideWhenUsed="1"/>
-    <w:lsdException w:name="List Number 4" w:semiHidden="1" w:unhideWhenUsed="1"/>
-    <w:lsdException w:name="List Number 5" w:semiHidden="1" w:unhideWhenUsed="1"/>
-    <w:lsdException w:name="Title" w:uiPriority="10" w:qFormat="1"/>
-    <w:lsdException w:name="Closing" w:semiHidden="1" w:unhideWhenUsed="1"/>
-    <w:lsdException w:name="Signature" w:semiHidden="1" w:unhideWhenUsed="1"/>
-    <w:lsdException w:name="Default Paragraph Font" w:semiHidden="1" w:uiPriority="1" w:unhideWhenUsed="1"/>
-    <w:lsdException w:name="Body Text" w:semiHidden="1" w:unhideWhenUsed="1"/>
-    <w:lsdException w:name="Body Text Indent" w:semiHidden="1" w:unhideWhenUsed="1"/>
-    <w:lsdException w:name="List Continue" w:semiHidden="1" w:unhideWhenUsed="1"/>
-    <w:lsdException w:name="List Continue 2" w:semiHidden="1" w:unhideWhenUsed="1"/>
-    <w:lsdException w:name="List Continue 3" w:semiHidden="1" w:unhideWhenUsed="1"/>
-    <w:lsdException w:name="List Continue 4" w:semiHidden="1" w:unhideWhenUsed="1"/>
-    <w:lsdException w:name="List Continue 5" w:semiHidden="1" w:unhideWhenUsed="1"/>
-    <w:lsdException w:name="Message Header" w:semiHidden="1" w:unhideWhenUsed="1"/>
-    <w:lsdException w:name="Subtitle" w:uiPriority="11" w:qFormat="1"/>
-    <w:lsdException w:name="Salutation" w:semiHidden="1" w:unhideWhenUsed="1"/>
-    <w:lsdException w:name="Date" w:semiHidden="1" w:unhideWhenUsed="1"/>
-    <w:lsdException w:name="Body Text First Indent" w:semiHidden="1" w:unhideWhenUsed="1"/>
-    <w:lsdException w:name="Body Text First Indent 2" w:semiHidden="1" w:unhideWhenUsed="1"/>
-    <w:lsdException w:name="Note Heading" w:semiHidden="1" w:unhideWhenUsed="1"/>
-    <w:lsdException w:name="Body Text 2" w:semiHidden="1" w:unhideWhenUsed="1"/>
-    <w:lsdException w:name="Body Text 3" w:semiHidden="1" w:unhideWhenUsed="1"/>
-    <w:lsdException w:name="Body Text Indent 2" w:semiHidden="1" w:unhideWhenUsed="1"/>
-    <w:lsdException w:name="Body Text Indent 3" w:semiHidden="1" w:unhideWhenUsed="1"/>
-    <w:lsdException w:name="Block Text" w:semiHidden="1" w:unhideWhenUsed="1"/>
-    <w:lsdException w:name="Hyperlink" w:semiHidden="1" w:unhideWhenUsed="1"/>
-    <w:lsdException w:name="FollowedHyperlink" w:semiHidden="1" w:unhideWhenUsed="1"/>
-    <w:lsdException w:name="Strong" w:uiPriority="22" w:qFormat="1"/>
-    <w:lsdException w:name="Emphasis" w:uiPriority="20" w:qFormat="1"/>
-    <w:lsdException w:name="Document Map" w:semiHidden="1" w:unhideWhenUsed="1"/>
-    <w:lsdException w:name="Plain Text" w:semiHidden="1" w:unhideWhenUsed="1"/>
-    <w:lsdException w:name="E-mail Signature" w:semiHidden="1" w:unhideWhenUsed="1"/>
-    <w:lsdException w:name="HTML Top of Form" w:semiHidden="1" w:unhideWhenUsed="1"/>
-    <w:lsdException w:name="HTML Bottom of Form" w:semiHidden="1" w:unhideWhenUsed="1"/>
-    <w:lsdException w:name="Normal (Web)" w:semiHidden="1" w:unhideWhenUsed="1"/>
-    <w:lsdException w:name="HTML Acronym" w:semiHidden="1" w:unhideWhenUsed="1"/>
-    <w:lsdException w:name="HTML Address" w:semiHidden="1" w:unhideWhenUsed="1"/>
-    <w:lsdException w:name="HTML Cite" w:semiHidden="1" w:unhideWhenUsed="1"/>
-    <w:lsdException w:name="HTML Code" w:semiHidden="1" w:unhideWhenUsed="1"/>
-    <w:lsdException w:name="HTML Definition" w:semiHidden="1" w:unhideWhenUsed="1"/>
-    <w:lsdException w:name="HTML Keyboard" w:semiHidden="1" w:unhideWhenUsed="1"/>
-    <w:lsdException w:name="HTML Preformatted" w:semiHidden="1" w:unhideWhenUsed="1"/>
-    <w:lsdException w:name="HTML Sample" w:semiHidden="1" w:unhideWhenUsed="1"/>
-    <w:lsdException w:name="HTML Typewriter" w:semiHidden="1" w:unhideWhenUsed="1"/>
-    <w:lsdException w:name="HTML Variable" w:semiHidden="1" w:unhideWhenUsed="1"/>
-    <w:lsdException w:name="Normal Table" w:semiHidden="1" w:unhideWhenUsed="1"/>
-    <w:lsdException w:name="annotation subject" w:semiHidden="1" w:unhideWhenUsed="1"/>
-    <w:lsdException w:name="No List" w:semiHidden="1" w:unhideWhenUsed="1"/>
-    <w:lsdException w:name="Outline List 1" w:semiHidden="1" w:unhideWhenUsed="1"/>
-    <w:lsdException w:name="Outline List 2" w:semiHidden="1" w:unhideWhenUsed="1"/>
-    <w:lsdException w:name="Outline List 3" w:semiHidden="1" w:unhideWhenUsed="1"/>
-    <w:lsdException w:name="Table Simple 1" w:semiHidden="1" w:unhideWhenUsed="1"/>
-    <w:lsdException w:name="Table Simple 2" w:semiHidden="1" w:unhideWhenUsed="1"/>
-    <w:lsdException w:name="Table Simple 3" w:semiHidden="1" w:unhideWhenUsed="1"/>
-    <w:lsdException w:name="Table Classic 1" w:semiHidden="1" w:unhideWhenUsed="1"/>
-    <w:lsdException w:name="Table Classic 2" w:semiHidden="1" w:unhideWhenUsed="1"/>
-    <w:lsdException w:name="Table Classic 3" w:semiHidden="1" w:unhideWhenUsed="1"/>
-    <w:lsdException w:name="Table Classic 4" w:semiHidden="1" w:unhideWhenUsed="1"/>
-    <w:lsdException w:name="Table Colorful 1" w:semiHidden="1" w:unhideWhenUsed="1"/>
-    <w:lsdException w:name="Table Colorful 2" w:semiHidden="1" w:unhideWhenUsed="1"/>
-    <w:lsdException w:name="Table Colorful 3" w:semiHidden="1" w:unhideWhenUsed="1"/>
-    <w:lsdException w:name="Table Columns 1" w:semiHidden="1" w:unhideWhenUsed="1"/>
-    <w:lsdException w:name="Table Columns 2" w:semiHidden="1" w:unhideWhenUsed="1"/>
-    <w:lsdException w:name="Table Columns 3" w:semiHidden="1" w:unhideWhenUsed="1"/>
-    <w:lsdException w:name="Table Columns 4" w:semiHidden="1" w:unhideWhenUsed="1"/>
-    <w:lsdException w:name="Table Columns 5" w:semiHidden="1" w:unhideWhenUsed="1"/>
-    <w:lsdException w:name="Table Grid 1" w:semiHidden="1" w:unhideWhenUsed="1"/>
-    <w:lsdException w:name="Table Grid 2" w:semiHidden="1" w:unhideWhenUsed="1"/>
-    <w:lsdException w:name="Table Grid 3" w:semiHidden="1" w:unhideWhenUsed="1"/>
-    <w:lsdException w:name="Table Grid 4" w:semiHidden="1" w:unhideWhenUsed="1"/>
-    <w:lsdException w:name="Table Grid 5" w:semiHidden="1" w:unhideWhenUsed="1"/>
-    <w:lsdException w:name="Table Grid 6" w:semiHidden="1" w:unhideWhenUsed="1"/>
-    <w:lsdException w:name="Table Grid 7" w:semiHidden="1" w:unhideWhenUsed="1"/>
-    <w:lsdException w:name="Table Grid 8" w:semiHidden="1" w:unhideWhenUsed="1"/>
-    <w:lsdException w:name="Table List 1" w:semiHidden="1" w:unhideWhenUsed="1"/>
-    <w:lsdException w:name="Table List 2" w:semiHidden="1" w:unhideWhenUsed="1"/>
-    <w:lsdException w:name="Table List 3" w:semiHidden="1" w:unhideWhenUsed="1"/>
-    <w:lsdException w:name="Table List 4" w:semiHidden="1" w:unhideWhenUsed="1"/>
-    <w:lsdException w:name="Table List 5" w:semiHidden="1" w:unhideWhenUsed="1"/>
-    <w:lsdException w:name="Table List 6" w:semiHidden="1" w:unhideWhenUsed="1"/>
-    <w:lsdException w:name="Table List 7" w:semiHidden="1" w:unhideWhenUsed="1"/>
-    <w:lsdException w:name="Table List 8" w:semiHidden="1" w:unhideWhenUsed="1"/>
-    <w:lsdException w:name="Table 3D effects 1" w:semiHidden="1" w:unhideWhenUsed="1"/>
-    <w:lsdException w:name="Table 3D effects 2" w:semiHidden="1" w:unhideWhenUsed="1"/>
-    <w:lsdException w:name="Table 3D effects 3" w:semiHidden="1" w:unhideWhenUsed="1"/>
-    <w:lsdException w:name="Table Contemporary" w:semiHidden="1" w:unhideWhenUsed="1"/>
-    <w:lsdException w:name="Table Elegant" w:semiHidden="1" w:unhideWhenUsed="1"/>
-    <w:lsdException w:name="Table Professional" w:semiHidden="1" w:unhideWhenUsed="1"/>
-    <w:lsdException w:name="Table Subtle 1" w:semiHidden="1" w:unhideWhenUsed="1"/>
-    <w:lsdException w:name="Table Subtle 2" w:semiHidden="1" w:unhideWhenUsed="1"/>
-    <w:lsdException w:name="Table Web 1" w:semiHidden="1" w:unhideWhenUsed="1"/>
-    <w:lsdException w:name="Table Web 2" w:semiHidden="1" w:unhideWhenUsed="1"/>
-    <w:lsdException w:name="Table Web 3" w:semiHidden="1" w:unhideWhenUsed="1"/>
-    <w:lsdException w:name="Balloon Text" w:semiHidden="1" w:unhideWhenUsed="1"/>
-    <w:lsdException w:name="Table Grid" w:uiPriority="39"/>
-    <w:lsdException w:name="Table Theme" w:semiHidden="1" w:unhideWhenUsed="1"/>
-    <w:lsdException w:name="Placeholder Text" w:semiHidden="1"/>
-    <w:lsdException w:name="No Spacing" w:uiPriority="1" w:qFormat="1"/>
-    <w:lsdException w:name="Light Shading" w:uiPriority="60"/>
-    <w:lsdException w:name="Light List" w:uiPriority="61"/>
-    <w:lsdException w:name="Light Grid" w:uiPriority="62"/>
-    <w:lsdException w:name="Medium Shading 1" w:uiPriority="63"/>
-    <w:lsdException w:name="Medium Shading 2" w:uiPriority="64"/>
-    <w:lsdException w:name="Medium List 1" w:uiPriority="65"/>
-    <w:lsdException w:name="Medium List 2" w:uiPriority="66"/>
-    <w:lsdException w:name="Medium Grid 1" w:uiPriority="67"/>
-    <w:lsdException w:name="Medium Grid 2" w:uiPriority="68"/>
-    <w:lsdException w:name="Medium Grid 3" w:uiPriority="69"/>
-    <w:lsdException w:name="Dark List" w:uiPriority="70"/>
-    <w:lsdException w:name="Colorful Shading" w:uiPriority="71"/>
-    <w:lsdException w:name="Colorful List" w:uiPriority="72"/>
-    <w:lsdException w:name="Colorful Grid" w:uiPriority="73"/>
-    <w:lsdException w:name="Light Shading Accent 1" w:uiPriority="60"/>
-    <w:lsdException w:name="Light List Accent 1" w:uiPriority="61"/>
-    <w:lsdException w:name="Light Grid Accent 1" w:uiPriority="62"/>
-    <w:lsdException w:name="Medium Shading 1 Accent 1" w:uiPriority="63"/>
-    <w:lsdException w:name="Medium Shading 2 Accent 1" w:uiPriority="64"/>
-    <w:lsdException w:name="Medium List 1 Accent 1" w:uiPriority="65"/>
-    <w:lsdException w:name="Revision" w:semiHidden="1"/>
-    <w:lsdException w:name="List Paragraph" w:uiPriority="34" w:qFormat="1"/>
-    <w:lsdException w:name="Quote" w:uiPriority="29" w:qFormat="1"/>
-    <w:lsdException w:name="Intense Quote" w:uiPriority="30" w:qFormat="1"/>
-    <w:lsdException w:name="Medium List 2 Accent 1" w:uiPriority="66"/>
-    <w:lsdException w:name="Medium Grid 1 Accent 1" w:uiPriority="67"/>
-    <w:lsdException w:name="Medium Grid 2 Accent 1" w:uiPriority="68"/>
-    <w:lsdException w:name="Medium Grid 3 Accent 1" w:uiPriority="69"/>
-    <w:lsdException w:name="Dark List Accent 1" w:uiPriority="70"/>
-    <w:lsdException w:name="Colorful Shading Accent 1" w:uiPriority="71"/>
-    <w:lsdException w:name="Colorful List Accent 1" w:uiPriority="72"/>
-    <w:lsdException w:name="Colorful Grid Accent 1" w:uiPriority="73"/>
-    <w:lsdException w:name="Light Shading Accent 2" w:uiPriority="60"/>
-    <w:lsdException w:name="Light List Accent 2" w:uiPriority="61"/>
-    <w:lsdException w:name="Light Grid Accent 2" w:uiPriority="62"/>
-    <w:lsdException w:name="Medium Shading 1 Accent 2" w:uiPriority="63"/>
-    <w:lsdException w:name="Medium Shading 2 Accent 2" w:uiPriority="64"/>
-    <w:lsdException w:name="Medium List 1 Accent 2" w:uiPriority="65"/>
-    <w:lsdException w:name="Medium List 2 Accent 2" w:uiPriority="66"/>
-    <w:lsdException w:name="Medium Grid 1 Accent 2" w:uiPriority="67"/>
-    <w:lsdException w:name="Medium Grid 2 Accent 2" w:uiPriority="68"/>
-    <w:lsdException w:name="Medium Grid 3 Accent 2" w:uiPriority="69"/>
-    <w:lsdException w:name="Dark List Accent 2" w:uiPriority="70"/>
-    <w:lsdException w:name="Colorful Shading Accent 2" w:uiPriority="71"/>
-    <w:lsdException w:name="Colorful List Accent 2" w:uiPriority="72"/>
-    <w:lsdException w:name="Colorful Grid Accent 2" w:uiPriority="73"/>
-    <w:lsdException w:name="Light Shading Accent 3" w:uiPriority="60"/>
-    <w:lsdException w:name="Light List Accent 3" w:uiPriority="61"/>
-    <w:lsdException w:name="Light Grid Accent 3" w:uiPriority="62"/>
-    <w:lsdException w:name="Medium Shading 1 Accent 3" w:uiPriority="63"/>
-    <w:lsdException w:name="Medium Shading 2 Accent 3" w:uiPriority="64"/>
-    <w:lsdException w:name="Medium List 1 Accent 3" w:uiPriority="65"/>
-    <w:lsdException w:name="Medium List 2 Accent 3" w:uiPriority="66"/>
-    <w:lsdException w:name="Medium Grid 1 Accent 3" w:uiPriority="67"/>
-    <w:lsdException w:name="Medium Grid 2 Accent 3" w:uiPriority="68"/>
-    <w:lsdException w:name="Medium Grid 3 Accent 3" w:uiPriority="69"/>
-    <w:lsdException w:name="Dark List Accent 3" w:uiPriority="70"/>
-    <w:lsdException w:name="Colorful Shading Accent 3" w:uiPriority="71"/>
-    <w:lsdException w:name="Colorful List Accent 3" w:uiPriority="72"/>
-    <w:lsdException w:name="Colorful Grid Accent 3" w:uiPriority="73"/>
-    <w:lsdException w:name="Light Shading Accent 4" w:uiPriority="60"/>
-    <w:lsdException w:name="Light List Accent 4" w:uiPriority="61"/>
-    <w:lsdException w:name="Light Grid Accent 4" w:uiPriority="62"/>
-    <w:lsdException w:name="Medium Shading 1 Accent 4" w:uiPriority="63"/>
-    <w:lsdException w:name="Medium Shading 2 Accent 4" w:uiPriority="64"/>
-    <w:lsdException w:name="Medium List 1 Accent 4" w:uiPriority="65"/>
-    <w:lsdException w:name="Medium List 2 Accent 4" w:uiPriority="66"/>
-    <w:lsdException w:name="Medium Grid 1 Accent 4" w:uiPriority="67"/>
-    <w:lsdException w:name="Medium Grid 2 Accent 4" w:uiPriority="68"/>
-    <w:lsdException w:name="Medium Grid 3 Accent 4" w:uiPriority="69"/>
-    <w:lsdException w:name="Dark List Accent 4" w:uiPriority="70"/>
-    <w:lsdException w:name="Colorful Shading Accent 4" w:uiPriority="71"/>
-    <w:lsdException w:name="Colorful List Accent 4" w:uiPriority="72"/>
-    <w:lsdException w:name="Colorful Grid Accent 4" w:uiPriority="73"/>
-    <w:lsdException w:name="Light Shading Accent 5" w:uiPriority="60"/>
-    <w:lsdException w:name="Light List Accent 5" w:uiPriority="61"/>
-    <w:lsdException w:name="Light Grid Accent 5" w:uiPriority="62"/>
-    <w:lsdException w:name="Medium Shading 1 Accent 5" w:uiPriority="63"/>
-    <w:lsdException w:name="Medium Shading 2 Accent 5" w:uiPriority="64"/>
-    <w:lsdException w:name="Medium List 1 Accent 5" w:uiPriority="65"/>
-    <w:lsdException w:name="Medium List 2 Accent 5" w:uiPriority="66"/>
-    <w:lsdException w:name="Medium Grid 1 Accent 5" w:uiPriority="67"/>
-    <w:lsdException w:name="Medium Grid 2 Accent 5" w:uiPriority="68"/>
-    <w:lsdException w:name="Medium Grid 3 Accent 5" w:uiPriority="69"/>
-    <w:lsdException w:name="Dark List Accent 5" w:uiPriority="70"/>
-    <w:lsdException w:name="Colorful Shading Accent 5" w:uiPriority="71"/>
-    <w:lsdException w:name="Colorful List Accent 5" w:uiPriority="72"/>
-    <w:lsdException w:name="Colorful Grid Accent 5" w:uiPriority="73"/>
-    <w:lsdException w:name="Light Shading Accent 6" w:uiPriority="60"/>
-    <w:lsdException w:name="Light List Accent 6" w:uiPriority="61"/>
-    <w:lsdException w:name="Light Grid Accent 6" w:uiPriority="62"/>
-    <w:lsdException w:name="Medium Shading 1 Accent 6" w:uiPriority="63"/>
-    <w:lsdException w:name="Medium Shading 2 Accent 6" w:uiPriority="64"/>
-    <w:lsdException w:name="Medium List 1 Accent 6" w:uiPriority="65"/>
-    <w:lsdException w:name="Medium List 2 Accent 6" w:uiPriority="66"/>
-    <w:lsdException w:name="Medium Grid 1 Accent 6" w:uiPriority="67"/>
-    <w:lsdException w:name="Medium Grid 2 Accent 6" w:uiPriority="68"/>
-    <w:lsdException w:name="Medium Grid 3 Accent 6" w:uiPriority="69"/>
-    <w:lsdException w:name="Dark List Accent 6" w:uiPriority="70"/>
-    <w:lsdException w:name="Colorful Shading Accent 6" w:uiPriority="71"/>
-    <w:lsdException w:name="Colorful List Accent 6" w:uiPriority="72"/>
-    <w:lsdException w:name="Colorful Grid Accent 6" w:uiPriority="73"/>
-    <w:lsdException w:name="Subtle Emphasis" w:uiPriority="19" w:qFormat="1"/>
-    <w:lsdException w:name="Intense Emphasis" w:uiPriority="21" w:qFormat="1"/>
-    <w:lsdException w:name="Subtle Reference" w:uiPriority="31" w:qFormat="1"/>
-    <w:lsdException w:name="Intense Reference" w:uiPriority="32" w:qFormat="1"/>
-    <w:lsdException w:name="Book Title" w:uiPriority="33" w:qFormat="1"/>
-    <w:lsdException w:name="Bibliography" w:semiHidden="1" w:uiPriority="37" w:unhideWhenUsed="1"/>
-    <w:lsdException w:name="TOC Heading" w:semiHidden="1" w:uiPriority="39" w:unhideWhenUsed="1" w:qFormat="1"/>
-    <w:lsdException w:name="Plain Table 1" w:uiPriority="41"/>
-    <w:lsdException w:name="Plain Table 2" w:uiPriority="42"/>
-    <w:lsdException w:name="Plain Table 3" w:uiPriority="43"/>
-    <w:lsdException w:name="Plain Table 4" w:uiPriority="44"/>
-    <w:lsdException w:name="Plain Table 5" w:uiPriority="45"/>
-    <w:lsdException w:name="Grid Table Light" w:uiPriority="40"/>
-    <w:lsdException w:name="Grid Table 1 Light" w:uiPriority="46"/>
-    <w:lsdException w:name="Grid Table 2" w:uiPriority="47"/>
-    <w:lsdException w:name="Grid Table 3" w:uiPriority="48"/>
-    <w:lsdException w:name="Grid Table 4" w:uiPriority="49"/>
-    <w:lsdException w:name="Grid Table 5 Dark" w:uiPriority="50"/>
-    <w:lsdException w:name="Grid Table 6 Colorful" w:uiPriority="51"/>
-    <w:lsdException w:name="Grid Table 7 Colorful" w:uiPriority="52"/>
-    <w:lsdException w:name="Grid Table 1 Light Accent 1" w:uiPriority="46"/>
-    <w:lsdException w:name="Grid Table 2 Accent 1" w:uiPriority="47"/>
-    <w:lsdException w:name="Grid Table 3 Accent 1" w:uiPriority="48"/>
-    <w:lsdException w:name="Grid Table 4 Accent 1" w:uiPriority="49"/>
-    <w:lsdException w:name="Grid Table 5 Dark Accent 1" w:uiPriority="50"/>
-    <w:lsdException w:name="Grid Table 6 Colorful Accent 1" w:uiPriority="51"/>
-    <w:lsdException w:name="Grid Table 7 Colorful Accent 1" w:uiPriority="52"/>
-    <w:lsdException w:name="Grid Table 1 Light Accent 2" w:uiPriority="46"/>
-    <w:lsdException w:name="Grid Table 2 Accent 2" w:uiPriority="47"/>
-    <w:lsdException w:name="Grid Table 3 Accent 2" w:uiPriority="48"/>
-    <w:lsdException w:name="Grid Table 4 Accent 2" w:uiPriority="49"/>
-    <w:lsdException w:name="Grid Table 5 Dark Accent 2" w:uiPriority="50"/>
-    <w:lsdException w:name="Grid Table 6 Colorful Accent 2" w:uiPriority="51"/>
-    <w:lsdException w:name="Grid Table 7 Colorful Accent 2" w:uiPriority="52"/>
-    <w:lsdException w:name="Grid Table 1 Light Accent 3" w:uiPriority="46"/>
-    <w:lsdException w:name="Grid Table 2 Accent 3" w:uiPriority="47"/>
-    <w:lsdException w:name="Grid Table 3 Accent 3" w:uiPriority="48"/>
-    <w:lsdException w:name="Grid Table 4 Accent 3" w:uiPriority="49"/>
-    <w:lsdException w:name="Grid Table 5 Dark Accent 3" w:uiPriority="50"/>
-    <w:lsdException w:name="Grid Table 6 Colorful Accent 3" w:uiPriority="51"/>
-    <w:lsdException w:name="Grid Table 7 Colorful Accent 3" w:uiPriority="52"/>
-    <w:lsdException w:name="Grid Table 1 Light Accent 4" w:uiPriority="46"/>
-    <w:lsdException w:name="Grid Table 2 Accent 4" w:uiPriority="47"/>
-    <w:lsdException w:name="Grid Table 3 Accent 4" w:uiPriority="48"/>
-    <w:lsdException w:name="Grid Table 4 Accent 4" w:uiPriority="49"/>
-    <w:lsdException w:name="Grid Table 5 Dark Accent 4" w:uiPriority="50"/>
-    <w:lsdException w:name="Grid Table 6 Colorful Accent 4" w:uiPriority="51"/>
-    <w:lsdException w:name="Grid Table 7 Colorful Accent 4" w:uiPriority="52"/>
-    <w:lsdException w:name="Grid Table 1 Light Accent 5" w:uiPriority="46"/>
-    <w:lsdException w:name="Grid Table 2 Accent 5" w:uiPriority="47"/>
-    <w:lsdException w:name="Grid Table 3 Accent 5" w:uiPriority="48"/>
-    <w:lsdException w:name="Grid Table 4 Accent 5" w:uiPriority="49"/>
-    <w:lsdException w:name="Grid Table 5 Dark Accent 5" w:uiPriority="50"/>
-    <w:lsdException w:name="Grid Table 6 Colorful Accent 5" w:uiPriority="51"/>
-    <w:lsdException w:name="Grid Table 7 Colorful Accent 5" w:uiPriority="52"/>
-    <w:lsdException w:name="Grid Table 1 Light Accent 6" w:uiPriority="46"/>
-    <w:lsdException w:name="Grid Table 2 Accent 6" w:uiPriority="47"/>
-    <w:lsdException w:name="Grid Table 3 Accent 6" w:uiPriority="48"/>
-    <w:lsdException w:name="Grid Table 4 Accent 6" w:uiPriority="49"/>
-    <w:lsdException w:name="Grid Table 5 Dark Accent 6" w:uiPriority="50"/>
-    <w:lsdException w:name="Grid Table 6 Colorful Accent 6" w:uiPriority="51"/>
-    <w:lsdException w:name="Grid Table 7 Colorful Accent 6" w:uiPriority="52"/>
-    <w:lsdException w:name="List Table 1 Light" w:uiPriority="46"/>
-    <w:lsdException w:name="List Table 2" w:uiPriority="47"/>
-    <w:lsdException w:name="List Table 3" w:uiPriority="48"/>
-    <w:lsdException w:name="List Table 4" w:uiPriority="49"/>
-    <w:lsdException w:name="List Table 5 Dark" w:uiPriority="50"/>
-    <w:lsdException w:name="List Table 6 Colorful" w:uiPriority="51"/>
-    <w:lsdException w:name="List Table 7 Colorful" w:uiPriority="52"/>
-    <w:lsdException w:name="List Table 1 Light Accent 1" w:uiPriority="46"/>
-    <w:lsdException w:name="List Table 2 Accent 1" w:uiPriority="47"/>
-    <w:lsdException w:name="List Table 3 Accent 1" w:uiPriority="48"/>
-    <w:lsdException w:name="List Table 4 Accent 1" w:uiPriority="49"/>
-    <w:lsdException w:name="List Table 5 Dark Accent 1" w:uiPriority="50"/>
-    <w:lsdException w:name="List Table 6 Colorful Accent 1" w:uiPriority="51"/>
-    <w:lsdException w:name="List Table 7 Colorful Accent 1" w:uiPriority="52"/>
-    <w:lsdException w:name="List Table 1 Light Accent 2" w:uiPriority="46"/>
-    <w:lsdException w:name="List Table 2 Accent 2" w:uiPriority="47"/>
-    <w:lsdException w:name="List Table 3 Accent 2" w:uiPriority="48"/>
-    <w:lsdException w:name="List Table 4 Accent 2" w:uiPriority="49"/>
-    <w:lsdException w:name="List Table 5 Dark Accent 2" w:uiPriority="50"/>
-    <w:lsdException w:name="List Table 6 Colorful Accent 2" w:uiPriority="51"/>
-    <w:lsdException w:name="List Table 7 Colorful Accent 2" w:uiPriority="52"/>
-    <w:lsdException w:name="List Table 1 Light Accent 3" w:uiPriority="46"/>
-    <w:lsdException w:name="List Table 2 Accent 3" w:uiPriority="47"/>
-    <w:lsdException w:name="List Table 3 Accent 3" w:uiPriority="48"/>
-    <w:lsdException w:name="List Table 4 Accent 3" w:uiPriority="49"/>
-    <w:lsdException w:name="List Table 5 Dark Accent 3" w:uiPriority="50"/>
-    <w:lsdException w:name="List Table 6 Colorful Accent 3" w:uiPriority="51"/>
-    <w:lsdException w:name="List Table 7 Colorful Accent 3" w:uiPriority="52"/>
-    <w:lsdException w:name="List Table 1 Light Accent 4" w:uiPriority="46"/>
-    <w:lsdException w:name="List Table 2 Accent 4" w:uiPriority="47"/>
-    <w:lsdException w:name="List Table 3 Accent 4" w:uiPriority="48"/>
-    <w:lsdException w:name="List Table 4 Accent 4" w:uiPriority="49"/>
-    <w:lsdException w:name="List Table 5 Dark Accent 4" w:uiPriority="50"/>
-    <w:lsdException w:name="List Table 6 Colorful Accent 4" w:uiPriority="51"/>
-    <w:lsdException w:name="List Table 7 Colorful Accent 4" w:uiPriority="52"/>
-    <w:lsdException w:name="List Table 1 Light Accent 5" w:uiPriority="46"/>
-    <w:lsdException w:name="List Table 2 Accent 5" w:uiPriority="47"/>
-    <w:lsdException w:name="List Table 3 Accent 5" w:uiPriority="48"/>
-    <w:lsdException w:name="List Table 4 Accent 5" w:uiPriority="49"/>
-    <w:lsdException w:name="List Table 5 Dark Accent 5" w:uiPriority="50"/>
-    <w:lsdException w:name="List Table 6 Colorful Accent 5" w:uiPriority="51"/>
-    <w:lsdException w:name="List Table 7 Colorful Accent 5" w:uiPriority="52"/>
-    <w:lsdException w:name="List Table 1 Light Accent 6" w:uiPriority="46"/>
-    <w:lsdException w:name="List Table 2 Accent 6" w:uiPriority="47"/>
-    <w:lsdException w:name="List Table 3 Accent 6" w:uiPriority="48"/>
-    <w:lsdException w:name="List Table 4 Accent 6" w:uiPriority="49"/>
-    <w:lsdException w:name="List Table 5 Dark Accent 6" w:uiPriority="50"/>
-    <w:lsdException w:name="List Table 6 Colorful Accent 6" w:uiPriority="51"/>
-    <w:lsdException w:name="List Table 7 Colorful Accent 6" w:uiPriority="52"/>
-    <w:lsdException w:name="Mention" w:semiHidden="1" w:unhideWhenUsed="1"/>
-    <w:lsdException w:name="Smart Hyperlink" w:semiHidden="1" w:unhideWhenUsed="1"/>
-    <w:lsdException w:name="Hashtag" w:semiHidden="1" w:unhideWhenUsed="1"/>
-    <w:lsdException w:name="Unresolved Mention" w:semiHidden="1" w:unhideWhenUsed="1"/>
-    <w:lsdException w:name="Smart Link" w:semiHidden="1" w:unhideWhenUsed="1"/>
-  </w:latentStyles>
-  <w:style w:type="paragraph" w:default="1" w:styleId="Normal">
-    <w:name w:val="Normal"/>
-    <w:qFormat/>
-  </w:style>
-  <w:style w:type="character" w:default="1" w:styleId="DefaultParagraphFont">
-    <w:name w:val="Default Paragraph Font"/>
-    <w:uiPriority w:val="1"/>
-    <w:semiHidden/>
-    <w:unhideWhenUsed/>
-  </w:style>
-  <w:style w:type="table" w:default="1" w:styleId="TableNormal">
-    <w:name w:val="Normal Table"/>
-    <w:uiPriority w:val="99"/>
-    <w:semiHidden/>
-    <w:unhideWhenUsed/>
-    <w:tblPr>
-      <w:tblInd w:w="0" w:type="dxa"/>
-      <w:tblCellMar>
-        <w:top w:w="0" w:type="dxa"/>
-        <w:left w:w="108" w:type="dxa"/>
-        <w:bottom w:w="0" w:type="dxa"/>
-        <w:right w:w="108" w:type="dxa"/>
-      </w:tblCellMar>
-    </w:tblPr>
-  </w:style>
-  <w:style w:type="numbering" w:default="1" w:styleId="NoList">
-    <w:name w:val="No List"/>
-    <w:uiPriority w:val="99"/>
-    <w:semiHidden/>
-    <w:unhideWhenUsed/>
-  </w:style>
-  <w:style w:type="paragraph" w:customStyle="1" w:styleId="2127A1DDDC8044A1A44284A04A165CEC">
-    <w:name w:val="2127A1DDDC8044A1A44284A04A165CEC"/>
-    <w:rsid w:val="008238CD"/>
-  </w:style>
-</w:styles>
-</file>
-
-<file path=word/glossary/webSettings.xml><?xml version="1.0" encoding="utf-8"?>
-<w:webSettings xmlns:mc="http://schemas.openxmlformats.org/markup-compatibility/2006" xmlns:r="http://schemas.openxmlformats.org/officeDocument/2006/relationships" xmlns:w="http://schemas.openxmlformats.org/wordprocessingml/2006/main" xmlns:w14="http://schemas.microsoft.com/office/word/2010/wordml" xmlns:w15="http://schemas.microsoft.com/office/word/2012/wordml" xmlns:w16cex="http://schemas.microsoft.com/office/word/2018/wordml/cex" xmlns:w16cid="http://schemas.microsoft.com/office/word/2016/wordml/cid" xmlns:w16="http://schemas.microsoft.com/office/word/2018/wordml" xmlns:w16sdtdh="http://schemas.microsoft.com/office/word/2020/wordml/sdtdatahash" xmlns:w16se="http://schemas.microsoft.com/office/word/2015/wordml/symex" mc:Ignorable="w14 w15 w16se w16cid w16 w16cex w16sdtdh">
-  <w:optimizeForBrowser/>
-  <w:allowPNG/>
-</w:webSettings>
-</file>
-
 <file path=word/theme/theme1.xml><?xml version="1.0" encoding="utf-8"?>
 <a:theme xmlns:a="http://schemas.openxmlformats.org/drawingml/2006/main" name="Office Theme">
   <a:themeElements>

</xml_diff>